<commit_message>
docs: Lastenheft-Eintrag fuer Snooze mit Uhrzeit + Notifications
Ergaenzt die Aenderungshistorie um den Requirements- und UX-Eintrag
fuer das zeitgenaue Zurueckstellen von Todos/Themen samt Web- und
nativer Notification (Feature aus Commit 3dfbc99), nachtraeglich per
Hand im selben Format, das requirements-engineer/ux-designer-Agenten
ab jetzt automatisiert pflegen.

Co-Authored-By: Claude Sonnet 5 <noreply@anthropic.com>
</commit_message>
<xml_diff>
--- a/Lastenheft_ThreadStack_v2.0.docx
+++ b/Lastenheft_ThreadStack_v2.0.docx
@@ -2184,6 +2184,96 @@
           <w:color w:val="888888"/>
         </w:rPr>
         <w:t xml:space="preserve">(Einträge werden ab hier automatisiert durch den Requirements-Engineer- und UX-Designer-Agenten ergänzt.)</w:t>
+      </w:r>
+    </w:p>
+    <w:p>
+      <w:r>
+        <w:rPr>
+          <w:b/>
+        </w:rPr>
+        <w:t xml:space="preserve">2026-08-09 — Snooze mit optionaler Uhrzeit + Notifications</w:t>
+      </w:r>
+    </w:p>
+    <w:p>
+      <w:r>
+        <w:t xml:space="preserve">Todos und Themen lassen sich jetzt wahlweise bis zu einer bestimmten Uhrzeit (statt nur bis zu einem Tag) zurückstellen. Ist eine Uhrzeit gesetzt, wacht das Element exakt zu diesem Zeitpunkt auf und der Nutzer erhält eine Notification — im Web per Browser-Notification (solange ein Tab offen ist), in der nativen iOS/macOS-App per lokaler Systembenachrichtigung (funktioniert auch im Hintergrund).</w:t>
+      </w:r>
+    </w:p>
+    <w:p>
+      <w:r>
+        <w:t xml:space="preserve">Neue/geänderte User Stories:</w:t>
+      </w:r>
+    </w:p>
+    <w:p>
+      <w:pPr>
+        <w:pStyle w:val="ListParagraph"/>
+      </w:pPr>
+      <w:r>
+        <w:t xml:space="preserve">– Zeitgenaues Zurückstellen eines Todos mit optionaler Uhrzeit</w:t>
+      </w:r>
+    </w:p>
+    <w:p>
+      <w:pPr>
+        <w:pStyle w:val="ListParagraph"/>
+      </w:pPr>
+      <w:r>
+        <w:t xml:space="preserve">– Zeitgenaues Zurückstellen eines Themas mit optionaler Uhrzeit</w:t>
+      </w:r>
+    </w:p>
+    <w:p>
+      <w:pPr>
+        <w:pStyle w:val="ListParagraph"/>
+      </w:pPr>
+      <w:r>
+        <w:t xml:space="preserve">– Browser-Notification beim Aufwachen einer zeitbasierten Todo-/Themen-Snooze (Web)</w:t>
+      </w:r>
+    </w:p>
+    <w:p>
+      <w:pPr>
+        <w:pStyle w:val="ListParagraph"/>
+      </w:pPr>
+      <w:r>
+        <w:t xml:space="preserve">– Lokale Systembenachrichtigung beim Aufwachen einer zeitbasierten Snooze (native App)</w:t>
+      </w:r>
+    </w:p>
+    <w:p>
+      <w:r>
+        <w:rPr>
+          <w:b/>
+        </w:rPr>
+        <w:t xml:space="preserve">Oberflächen: Snooze mit optionaler Uhrzeit</w:t>
+      </w:r>
+    </w:p>
+    <w:p>
+      <w:pPr>
+        <w:pStyle w:val="ListParagraph"/>
+      </w:pPr>
+      <w:r>
+        <w:t xml:space="preserve">– Todo-Bearbeiten-Modal (Web) — Checkbox „zu einer bestimmten Uhrzeit aufwecken" mit Zeit-Eingabefeld neben dem bestehenden Datumsfeld</w:t>
+      </w:r>
+    </w:p>
+    <w:p>
+      <w:pPr>
+        <w:pStyle w:val="ListParagraph"/>
+      </w:pPr>
+      <w:r>
+        <w:t xml:space="preserve">– Themen-Bearbeiten-Modal (Web) — identisches Muster wie beim Todo-Modal</w:t>
+      </w:r>
+    </w:p>
+    <w:p>
+      <w:pPr>
+        <w:pStyle w:val="ListParagraph"/>
+      </w:pPr>
+      <w:r>
+        <w:t xml:space="preserve">– TodoFormView (native App) — Toggle „zu bestimmter Uhrzeit" mit Uhrzeit-Picker unter dem bestehenden Datums-Picker</w:t>
+      </w:r>
+    </w:p>
+    <w:p>
+      <w:pPr>
+        <w:pStyle w:val="ListParagraph"/>
+      </w:pPr>
+      <w:r>
+        <w:t xml:space="preserve">– TopicFormView (native App) — auf dasselbe Niveau wie TodoFormView gehoben (vorher nur ungeprüftes Freitextfeld), inkl. Uhrzeit-Picker</w:t>
       </w:r>
     </w:p>
     <w:sectPr>

</xml_diff>

<commit_message>
docs: Lastenheft-Eintraege fuer KI-Link-Zusammenfassung (Requirements + UX)
Ergaenzt die Aenderungshistorie um die neuen User Stories und die neuen
Oberflaechen fuer das Feature "KI-Zusammenfassung beim Einfuegen von
Links" (Link-Dialog Web, Lade-/Vorschau-Zustand, Editor-Kennzeichnung,
natives Link-Sheet), von requirements-engineer und ux-designer waehrend
der Planungsphase automatisiert ergaenzt.

Co-Authored-By: Claude Sonnet 5 <noreply@anthropic.com>
</commit_message>
<xml_diff>
--- a/Lastenheft_ThreadStack_v2.0.docx
+++ b/Lastenheft_ThreadStack_v2.0.docx
@@ -2274,6 +2274,144 @@
       </w:pPr>
       <w:r>
         <w:t xml:space="preserve">– TopicFormView (native App) — auf dasselbe Niveau wie TodoFormView gehoben (vorher nur ungeprüftes Freitextfeld), inkl. Uhrzeit-Picker</w:t>
+      </w:r>
+    </w:p>
+    <w:p>
+      <w:r>
+        <w:rPr>
+          <w:b/>
+        </w:rPr>
+        <w:t xml:space="preserve">2026-08-09 — KI-Zusammenfassung beim Einfügen von Links</w:t>
+      </w:r>
+    </w:p>
+    <w:p>
+      <w:r>
+        <w:t xml:space="preserve">Der bestehende „Link einfügen"-Button im Rich-Text-Editor wird erweitert: Nutzer können beim Einfügen eines Links wählen, ob nur der reine Link oder zusätzlich eine automatisch erzeugte KI-Zusammenfassung des verlinkten Inhalts eingefügt wird. Die gewünschte Länge der Zusammenfassung ist dabei einfach steuerbar. Die Funktion nutzt die bestehende KI-Konfiguration (Provider, API-Key, Feature-Schalter, Kosten-/Budgetgrenzen, Nutzungsprotokoll); ist keine KI konfiguriert oder schlägt der Abruf fehl, bleibt das reine Einfügen des Links jederzeit möglich.</w:t>
+      </w:r>
+    </w:p>
+    <w:p>
+      <w:r>
+        <w:t xml:space="preserve">Neue/geänderte User Stories:</w:t>
+      </w:r>
+    </w:p>
+    <w:p>
+      <w:pPr>
+        <w:pStyle w:val="ListParagraph"/>
+      </w:pPr>
+      <w:r>
+        <w:t xml:space="preserve">– Link wie bisher ohne Zusammenfassung einfügen (unveränderter Basisfall)</w:t>
+      </w:r>
+    </w:p>
+    <w:p>
+      <w:pPr>
+        <w:pStyle w:val="ListParagraph"/>
+      </w:pPr>
+      <w:r>
+        <w:t xml:space="preserve">– Link mit KI-Zusammenfassung des verlinkten Inhalts einfügen</w:t>
+      </w:r>
+    </w:p>
+    <w:p>
+      <w:pPr>
+        <w:pStyle w:val="ListParagraph"/>
+      </w:pPr>
+      <w:r>
+        <w:t xml:space="preserve">– Länge der Zusammenfassung beim Einfügen wählen (Stufen kurz/mittel/lang)</w:t>
+      </w:r>
+    </w:p>
+    <w:p>
+      <w:pPr>
+        <w:pStyle w:val="ListParagraph"/>
+      </w:pPr>
+      <w:r>
+        <w:t xml:space="preserve">– Zuletzt gewählte Einstellungen als Voreinstellung übernehmen</w:t>
+      </w:r>
+    </w:p>
+    <w:p>
+      <w:pPr>
+        <w:pStyle w:val="ListParagraph"/>
+      </w:pPr>
+      <w:r>
+        <w:t xml:space="preserve">– Verständliche Rückmeldung, wenn die KI nicht konfiguriert oder das Feature deaktiviert ist</w:t>
+      </w:r>
+    </w:p>
+    <w:p>
+      <w:pPr>
+        <w:pStyle w:val="ListParagraph"/>
+      </w:pPr>
+      <w:r>
+        <w:t xml:space="preserve">– Verständliche Rückmeldung, wenn die Seite nicht erreichbar ist oder keinen auswertbaren Text liefert</w:t>
+      </w:r>
+    </w:p>
+    <w:p>
+      <w:pPr>
+        <w:pStyle w:val="ListParagraph"/>
+      </w:pPr>
+      <w:r>
+        <w:t xml:space="preserve">– Laufende Zusammenfassung abwarten oder abbrechen, ohne den Editor zu blockieren</w:t>
+      </w:r>
+    </w:p>
+    <w:p>
+      <w:pPr>
+        <w:pStyle w:val="ListParagraph"/>
+      </w:pPr>
+      <w:r>
+        <w:t xml:space="preserve">– Erzeugte Zusammenfassung vor dem Übernehmen prüfen und verwerfen können</w:t>
+      </w:r>
+    </w:p>
+    <w:p>
+      <w:pPr>
+        <w:pStyle w:val="ListParagraph"/>
+      </w:pPr>
+      <w:r>
+        <w:t xml:space="preserve">– Schutz vor Abruf interner/nicht-öffentlicher Adressen beim Laden der Zielseite</w:t>
+      </w:r>
+    </w:p>
+    <w:p>
+      <w:r>
+        <w:rPr>
+          <w:b/>
+        </w:rPr>
+        <w:t xml:space="preserve">Oberflächen: KI-Zusammenfassung beim Einfügen von Links</w:t>
+      </w:r>
+    </w:p>
+    <w:p>
+      <w:pPr>
+        <w:pStyle w:val="ListParagraph"/>
+      </w:pPr>
+      <w:r>
+        <w:t xml:space="preserve">Link-Dialog „Link einfügen" (Web, index.html) — erweiterter bestehender Dialog mit Modus-Wahl „Nur Link" / „Link + KI-Zusammenfassung", Längenstufe (kurz/mittel/lang), Datenschutz-Hinweis vor Bestätigung sowie Fehlerzuständen; ersetzt den bisherigen einfachen URL-Prompt.</w:t>
+      </w:r>
+    </w:p>
+    <w:p>
+      <w:pPr>
+        <w:pStyle w:val="ListParagraph"/>
+      </w:pPr>
+      <w:r>
+        <w:t xml:space="preserve">Fortschritts-/Ladezustand des Link-Dialogs (Web) — nicht-blockierende Statusanzeige während der Zusammenfassungs-Erzeugung mit Abbrechen-Option; Nutzer kann währenddessen im Editor weiterarbeiten.</w:t>
+      </w:r>
+    </w:p>
+    <w:p>
+      <w:pPr>
+        <w:pStyle w:val="ListParagraph"/>
+      </w:pPr>
+      <w:r>
+        <w:t xml:space="preserve">Zusammenfassungs-Vorschau im Link-Dialog (Web) — zeigt die erzeugte Zusammenfassung vor dem Einfügen mit den Aktionen „Übernehmen", „Verwerfen" und „Neu erzeugen".</w:t>
+      </w:r>
+    </w:p>
+    <w:p>
+      <w:pPr>
+        <w:pStyle w:val="ListParagraph"/>
+      </w:pPr>
+      <w:r>
+        <w:t xml:space="preserve">KI-Zusammenfassungs-Markierung im Editor-Inhalt (Web) — eigener, visuell abgesetzter Absatz mit Icon/Label „✨ KI-Zusammenfassung" direkt unter dem eingefügten Link.</w:t>
+      </w:r>
+    </w:p>
+    <w:p>
+      <w:pPr>
+        <w:pStyle w:val="ListParagraph"/>
+      </w:pPr>
+      <w:r>
+        <w:t xml:space="preserve">Link-mit-Zusammenfassung-Sheet (native iOS/macOS-App) — neues SwiftUI-Sheet nach dem Muster von AIBriefSheet/AICaptureSheet mit Modus-Wahl, Längenstufe, Datenschutz-Hinweis, Lade-/Fehlerzustand und Vorschau; fügt den formatierten Textblock in das jeweilige Beschreibungsfeld ein.</w:t>
       </w:r>
     </w:p>
     <w:sectPr>

</xml_diff>

<commit_message>
docs: Lastenheft-Eintraege fuer nativen Wissens-Editor (Requirements + UX)
Co-Authored-By: Claude Sonnet 5 <noreply@anthropic.com>
</commit_message>
<xml_diff>
--- a/Lastenheft_ThreadStack_v2.0.docx
+++ b/Lastenheft_ThreadStack_v2.0.docx
@@ -2412,6 +2412,178 @@
       </w:pPr>
       <w:r>
         <w:t xml:space="preserve">Link-mit-Zusammenfassung-Sheet (native iOS/macOS-App) — neues SwiftUI-Sheet nach dem Muster von AIBriefSheet/AICaptureSheet mit Modus-Wahl, Längenstufe, Datenschutz-Hinweis, Lade-/Fehlerzustand und Vorschau; fügt den formatierten Textblock in das jeweilige Beschreibungsfeld ein.</w:t>
+      </w:r>
+    </w:p>
+    <w:p>
+      <w:r>
+        <w:rPr>
+          <w:b/>
+        </w:rPr>
+        <w:t xml:space="preserve">2026-08-10 — Nativer Rich-Text-Editor für Wissen (iOS/macOS)</w:t>
+      </w:r>
+    </w:p>
+    <w:p>
+      <w:r>
+        <w:t xml:space="preserve">Die Wissens-Funktion der nativen iOS/macOS-App war bisher bewusst rein lesend; Wissensseiten konnten ausschließlich in der Web-App erstellt und bearbeitet werden. Mit dieser Anforderung erhält die native App einen vollwertigen Rich-Text-Editor, mit dem Wissensseiten direkt in der App angelegt, formatiert, verknüpft und gelöscht werden können. Als verbindlicher Mindestumfang der Formatierung gelten Fett, Kursiv, Unterstrichen, Aufzählung und Links; Tabellen, Bilder und Textfarbe sind im Web-Editor vorhanden, für die native App jedoch als spätere Ausbaustufe eingestuft. Verwandtes-Wissen-Verknüpfung und Anhänge sind als nachgelagerte Iterationen beschrieben, da beide in der nativen App bisher überhaupt nicht existieren.</w:t>
+      </w:r>
+    </w:p>
+    <w:p>
+      <w:r>
+        <w:t xml:space="preserve">Neue/geänderte User Stories:</w:t>
+      </w:r>
+    </w:p>
+    <w:p>
+      <w:pPr>
+        <w:pStyle w:val="ListParagraph"/>
+      </w:pPr>
+      <w:r>
+        <w:t xml:space="preserve">– Wissensseite in der nativen App neu anlegen (Titel + formatierter Inhalt)</w:t>
+      </w:r>
+    </w:p>
+    <w:p>
+      <w:pPr>
+        <w:pStyle w:val="ListParagraph"/>
+      </w:pPr>
+      <w:r>
+        <w:t xml:space="preserve">– Bestehende Wissensseite in der nativen App bearbeiten</w:t>
+      </w:r>
+    </w:p>
+    <w:p>
+      <w:pPr>
+        <w:pStyle w:val="ListParagraph"/>
+      </w:pPr>
+      <w:r>
+        <w:t xml:space="preserve">– Basis-Formatierung im nativen Editor (Fett, Kursiv, Unterstrichen, Aufzählung)</w:t>
+      </w:r>
+    </w:p>
+    <w:p>
+      <w:pPr>
+        <w:pStyle w:val="ListParagraph"/>
+      </w:pPr>
+      <w:r>
+        <w:t xml:space="preserve">– Link im nativen Editor einfügen und bearbeiten</w:t>
+      </w:r>
+    </w:p>
+    <w:p>
+      <w:pPr>
+        <w:pStyle w:val="ListParagraph"/>
+      </w:pPr>
+      <w:r>
+        <w:t xml:space="preserve">– Topic-Zuordnung einer Wissensseite in der nativen App pflegen</w:t>
+      </w:r>
+    </w:p>
+    <w:p>
+      <w:pPr>
+        <w:pStyle w:val="ListParagraph"/>
+      </w:pPr>
+      <w:r>
+        <w:t xml:space="preserve">– Wissensseite in der nativen App löschen</w:t>
+      </w:r>
+    </w:p>
+    <w:p>
+      <w:pPr>
+        <w:pStyle w:val="ListParagraph"/>
+      </w:pPr>
+      <w:r>
+        <w:t xml:space="preserve">– Ungespeicherte Änderungen schützen (Abbrechen-Rückfrage, Entwurfs-Wiederherstellung)</w:t>
+      </w:r>
+    </w:p>
+    <w:p>
+      <w:pPr>
+        <w:pStyle w:val="ListParagraph"/>
+      </w:pPr>
+      <w:r>
+        <w:t xml:space="preserve">– Fehler- und Offline-Verhalten beim Speichern aus der nativen App</w:t>
+      </w:r>
+    </w:p>
+    <w:p>
+      <w:pPr>
+        <w:pStyle w:val="ListParagraph"/>
+      </w:pPr>
+      <w:r>
+        <w:t xml:space="preserve">– Wissen direkt aus einem Topic-Kontext anlegen (native Schnellerfassung)</w:t>
+      </w:r>
+    </w:p>
+    <w:p>
+      <w:pPr>
+        <w:pStyle w:val="ListParagraph"/>
+      </w:pPr>
+      <w:r>
+        <w:t xml:space="preserve">– Verwandtes Wissen verknüpfen (native App, nachgelagerte Iteration)</w:t>
+      </w:r>
+    </w:p>
+    <w:p>
+      <w:pPr>
+        <w:pStyle w:val="ListParagraph"/>
+      </w:pPr>
+      <w:r>
+        <w:t xml:space="preserve">– Anhänge an Wissensseiten in der nativen App (nachgelagerte Iteration)</w:t>
+      </w:r>
+    </w:p>
+    <w:p>
+      <w:r>
+        <w:t xml:space="preserve">Offene Punkte mit Architektur-Relevanz: Wahl der nativen Rich-Text-Technologie (TextKit/AttributedString-basiertes Formatierungs-UI vs. eingebettete WKWebView mit dem contenteditable-Editor der Web-App), verbindliche Festlegung des Formatierungs-Mindestumfangs sowie Zuschnitt des MVP hinsichtlich verwandtem Wissen und Anhängen.</w:t>
+      </w:r>
+    </w:p>
+    <w:p>
+      <w:r>
+        <w:rPr>
+          <w:b/>
+        </w:rPr>
+        <w:t xml:space="preserve">Oberflächen: Nativer Rich-Text-Editor für Wissen (iOS/macOS)</w:t>
+      </w:r>
+    </w:p>
+    <w:p>
+      <w:r>
+        <w:t xml:space="preserve">Die folgenden neuen bzw. veränderten Screens/Komponenten setzen den obenstehenden Funktionsumfang um:</w:t>
+      </w:r>
+    </w:p>
+    <w:p>
+      <w:pPr>
+        <w:pStyle w:val="ListParagraph"/>
+      </w:pPr>
+      <w:r>
+        <w:t xml:space="preserve">– KnowledgeEditorView (Sheet, Modus „Neu"/„Bearbeiten"): zentraler Editor-Screen mit Titelfeld, nativer Formatierungs-Toolbar außerhalb der WKWebView, eingebetteter Rich-Text-Editorfläche, Bereichen „Zugehörige Topics" und „Verwandtes Wissen", Draft-Banner sowie Fehler-/Teilerfolgs-Bannern.</w:t>
+      </w:r>
+    </w:p>
+    <w:p>
+      <w:pPr>
+        <w:pStyle w:val="ListParagraph"/>
+      </w:pPr>
+      <w:r>
+        <w:t xml:space="preserve">– KnowledgeLinkInsertSheet: Sub-Sheet zum Einfügen von Links im Editor, analog zum bestehenden LinkInsertSheet.swift, jedoch mit echter formatierter Rich-Text-Einfügung (inkl. Modus „Link + KI-Zusammenfassung").</w:t>
+      </w:r>
+    </w:p>
+    <w:p>
+      <w:pPr>
+        <w:pStyle w:val="ListParagraph"/>
+      </w:pPr>
+      <w:r>
+        <w:t xml:space="preserve">– KnowledgeDeleteConfirmView: Bestätigungsdialog vor dem endgültigen Löschen einer Wissensseite, inkl. Seitentitel im Hinweistext.</w:t>
+      </w:r>
+    </w:p>
+    <w:p>
+      <w:pPr>
+        <w:pStyle w:val="ListParagraph"/>
+      </w:pPr>
+      <w:r>
+        <w:t xml:space="preserve">– KnowledgeDiscardChangesAlert: Rückfrage-Dialog beim Verwerfen ungespeicherter Änderungen (Abbrechen/Dismiss-Geste).</w:t>
+      </w:r>
+    </w:p>
+    <w:p>
+      <w:pPr>
+        <w:pStyle w:val="ListParagraph"/>
+      </w:pPr>
+      <w:r>
+        <w:t xml:space="preserve">– KnowledgeRelatedRemoveConfirmView: Bestätigungsdialog beim Entfernen einer Verknüpfung zu verwandtem Wissen.</w:t>
+      </w:r>
+    </w:p>
+    <w:p>
+      <w:pPr>
+        <w:pStyle w:val="ListParagraph"/>
+      </w:pPr>
+      <w:r>
+        <w:t xml:space="preserve">– Angepasste Bestandsscreens: KnowledgeView.swift (editierbarer Leerzustand mit direkter „Neues Wissen"-Aktion statt Verweis auf die Web-App), KnowledgeDetailView in ThemesView.swift (Bearbeiten-/Löschen-Aktionen statt Read-only-Badge, „Wissen hinzufügen" im Wissens-Abschnitt) sowie der Read-only-Hinweis in GraphView.swift, der durch echten Bearbeitungszugriff ersetzt wird.</w:t>
       </w:r>
     </w:p>
     <w:sectPr>

</xml_diff>

<commit_message>
docs: Lastenheft-Eintraege fuer formatierungstreuen Word-Export
Co-Authored-By: Claude Sonnet 5 <noreply@anthropic.com>
</commit_message>
<xml_diff>
--- a/Lastenheft_ThreadStack_v2.0.docx
+++ b/Lastenheft_ThreadStack_v2.0.docx
@@ -2584,6 +2584,173 @@
       </w:pPr>
       <w:r>
         <w:t xml:space="preserve">– Angepasste Bestandsscreens: KnowledgeView.swift (editierbarer Leerzustand mit direkter „Neues Wissen"-Aktion statt Verweis auf die Web-App), KnowledgeDetailView in ThemesView.swift (Bearbeiten-/Löschen-Aktionen statt Read-only-Badge, „Wissen hinzufügen" im Wissens-Abschnitt) sowie der Read-only-Hinweis in GraphView.swift, der durch echten Bearbeitungszugriff ersetzt wird.</w:t>
+      </w:r>
+    </w:p>
+    <w:p>
+      <w:r>
+        <w:rPr>
+          <w:b/>
+        </w:rPr>
+        <w:t xml:space="preserve">2026-08-12 — Formatierungstreuer und übersichtlicherer Word-Export</w:t>
+      </w:r>
+    </w:p>
+    <w:p>
+      <w:r>
+        <w:t xml:space="preserve">Der bestehende Word-Export (DOCX) gibt Rich-Text-Inhalte bislang nur eingeschränkt formatiert wieder: Todo-Beschreibungen und -Ergebnisse erscheinen als roher HTML-Quelltext, Tabellen ohne Rahmen und Kopfzeilen-Hervorhebung, verschachtelte Listen flach, Zitate und Codeblöcke ohne erkennbare Auszeichnung, Bilder in fest vorgegebener Größe mit verzerrtem Seitenverhältnis. Ziel dieser Anforderung ist, dass exportierte Inhalte optisch dem Erscheinungsbild in der App entsprechen (Auszeichnungen, Listen, Tabellen, Überschriften, Links, Textfarbe, Bilder) und das Gesamtdokument durch Titelseite, Inhaltsverzeichnis, klare Abschnittstrennung, Fußzeile mit Seitenzahl und ein am Corporate Design orientiertes Typografie- und Farbschema deutlich übersichtlicher wird. Zusätzlich wird der derzeitige Verlust von Textfarben in Wissensseiten (Farbinformation wird bereits beim Speichern verworfen) als eigene Anforderung erfasst.</w:t>
+      </w:r>
+    </w:p>
+    <w:p>
+      <w:r>
+        <w:t xml:space="preserve">Neue/geänderte User Stories:</w:t>
+      </w:r>
+    </w:p>
+    <w:p>
+      <w:pPr>
+        <w:pStyle w:val="ListParagraph"/>
+      </w:pPr>
+      <w:r>
+        <w:t xml:space="preserve">– Story 1: Rich-Text-Formatierung in Todo-Beschreibung und -Ergebnis korrekt exportieren</w:t>
+      </w:r>
+    </w:p>
+    <w:p>
+      <w:pPr>
+        <w:pStyle w:val="ListParagraph"/>
+      </w:pPr>
+      <w:r>
+        <w:t xml:space="preserve">– Story 2: Verschachtelte und fortlaufend nummerierte Listen formattreu exportieren</w:t>
+      </w:r>
+    </w:p>
+    <w:p>
+      <w:pPr>
+        <w:pStyle w:val="ListParagraph"/>
+      </w:pPr>
+      <w:r>
+        <w:t xml:space="preserve">– Story 3: Tabellen mit Rahmen, hervorgehobener Kopfzeile und Zellverbünden exportieren</w:t>
+      </w:r>
+    </w:p>
+    <w:p>
+      <w:pPr>
+        <w:pStyle w:val="ListParagraph"/>
+      </w:pPr>
+      <w:r>
+        <w:t xml:space="preserve">– Story 4: Zitate, Codeblöcke und Trennlinien visuell unterscheidbar exportieren</w:t>
+      </w:r>
+    </w:p>
+    <w:p>
+      <w:pPr>
+        <w:pStyle w:val="ListParagraph"/>
+      </w:pPr>
+      <w:r>
+        <w:t xml:space="preserve">– Story 5: Bilder seitenverhältnistreu und auf Satzspiegelbreite begrenzt exportieren</w:t>
+      </w:r>
+    </w:p>
+    <w:p>
+      <w:pPr>
+        <w:pStyle w:val="ListParagraph"/>
+      </w:pPr>
+      <w:r>
+        <w:t xml:space="preserve">– Story 6: Textfarben aus dem Editor im Export erhalten (inkl. Behebung des Farbverlusts beim Speichern von Wissensseiten)</w:t>
+      </w:r>
+    </w:p>
+    <w:p>
+      <w:pPr>
+        <w:pStyle w:val="ListParagraph"/>
+      </w:pPr>
+      <w:r>
+        <w:t xml:space="preserve">– Story 7: Dokumentweites Typografie- und Farbschema passend zum App-Design</w:t>
+      </w:r>
+    </w:p>
+    <w:p>
+      <w:pPr>
+        <w:pStyle w:val="ListParagraph"/>
+      </w:pPr>
+      <w:r>
+        <w:t xml:space="preserve">– Story 8: Titelseite und Inhaltsverzeichnis für schnelle Navigation</w:t>
+      </w:r>
+    </w:p>
+    <w:p>
+      <w:pPr>
+        <w:pStyle w:val="ListParagraph"/>
+      </w:pPr>
+      <w:r>
+        <w:t xml:space="preserve">– Story 9: Übersichtliche Abschnittsstruktur mit Seitenumbrüchen, Kopf-/Fußzeile und Seitenzahlen</w:t>
+      </w:r>
+    </w:p>
+    <w:p>
+      <w:pPr>
+        <w:pStyle w:val="ListParagraph"/>
+      </w:pPr>
+      <w:r>
+        <w:t xml:space="preserve">– Story 10: Robustheit des Exports bei fehlerhaften oder leeren Inhalten</w:t>
+      </w:r>
+    </w:p>
+    <w:p>
+      <w:r>
+        <w:rPr>
+          <w:b/>
+        </w:rPr>
+        <w:t xml:space="preserve">Oberflächen: Formatierungstreuer und übersichtlicherer Word-Export</w:t>
+      </w:r>
+    </w:p>
+    <w:p>
+      <w:r>
+        <w:t xml:space="preserve">Die folgenden neuen bzw. veränderten Screens/Komponenten setzen den obenstehenden Funktionsumfang um:</w:t>
+      </w:r>
+    </w:p>
+    <w:p>
+      <w:pPr>
+        <w:pStyle w:val="ListParagraph"/>
+      </w:pPr>
+      <w:r>
+        <w:t xml:space="preserve">– Exportiertes Word-Dokument – Titelseite: Dokumenttitel, gewählter Export-Umfang (Wissen / Todos &amp; Tasks / Beides), Exportdatum und gewählte Optionen (Topic-Struktur ja/nein, nur offene Todos ja/nein) auf eigener, seitenzahlfreier erster Seite.</w:t>
+      </w:r>
+    </w:p>
+    <w:p>
+      <w:pPr>
+        <w:pStyle w:val="ListParagraph"/>
+      </w:pPr>
+      <w:r>
+        <w:t xml:space="preserve">– Exportiertes Word-Dokument – Inhaltsverzeichnis: Word-Feld TableOfContents auf eigener Seite direkt nach der Titelseite, mit Hinweisabsatz „Inhaltsverzeichnis in Word mit F9 aktualisieren“, ersatzweise Hinweistext bei leerem Export.</w:t>
+      </w:r>
+    </w:p>
+    <w:p>
+      <w:pPr>
+        <w:pStyle w:val="ListParagraph"/>
+      </w:pPr>
+      <w:r>
+        <w:t xml:space="preserve">– Exportiertes Word-Dokument – Abschnitt „Wissen“: eigene Seite je Hauptabschnitt, Wissensseiten durch Überschrift plus Trennlinie (kein Seitenumbruch) getrennt, Metadatenblock (Topics, verwandtes Wissen) optisch abgesetzt unter dem Seitentitel, formattreue Wiedergabe von Listen, Tabellen (mit hervorgehobener, seitenumbruchfester Kopfzeile), Zitaten, Codeblöcken, Trennlinien, Bildern (seitenverhältnistreu skaliert) und Textfarben.</w:t>
+      </w:r>
+    </w:p>
+    <w:p>
+      <w:pPr>
+        <w:pStyle w:val="ListParagraph"/>
+      </w:pPr>
+      <w:r>
+        <w:t xml:space="preserve">– Exportiertes Word-Dokument – Abschnitt „Todos &amp; Tasks“: eigene Seite, Unterabschnitte „Offen“ und „Erledigt“, erledigte Todos mit durchgestrichenem Titel gekennzeichnet, formattreue Beschreibungs- und Ergebnistexte.</w:t>
+      </w:r>
+    </w:p>
+    <w:p>
+      <w:pPr>
+        <w:pStyle w:val="ListParagraph"/>
+      </w:pPr>
+      <w:r>
+        <w:t xml:space="preserve">– Exportiertes Word-Dokument – Fußzeile: „Seite X von Y · ThreadStack Export vom &lt;Datum&gt;“ ab Seite 2, Titelseite ohne Seitenzahl.</w:t>
+      </w:r>
+    </w:p>
+    <w:p>
+      <w:pPr>
+        <w:pStyle w:val="ListParagraph"/>
+      </w:pPr>
+      <w:r>
+        <w:t xml:space="preserve">– Export-Modal (index.html): ergänzender Hinweistext zur formattreuen Word-Ausgabe (Farben, Tabellen, Listen) bei Formatwahl „Word-Dokument (.docx)“.</w:t>
+      </w:r>
+    </w:p>
+    <w:p>
+      <w:pPr>
+        <w:pStyle w:val="ListParagraph"/>
+      </w:pPr>
+      <w:r>
+        <w:t xml:space="preserve">– Editor-Farbwähler (rt-color-popup / SWATCHES): unverändertes Interaktionsmuster (Swatch-Auswahl statt Freitext-Hex, feste Allowlist), Farbwerte für Orange/Gelb/Grün vorbehaltlich separater Kontrastentscheidung ggf. auf kontrastkonforme Töne angepasst.</w:t>
       </w:r>
     </w:p>
     <w:sectPr>

</xml_diff>